<commit_message>
feat: landscape GIS map popups, z-index isolation fixes, user provisioning CLI, and Bhashini docs
</commit_message>
<xml_diff>
--- a/TheLOLgorithms_AshutoshSingh_7985481629.docx
+++ b/TheLOLgorithms_AshutoshSingh_7985481629.docx
@@ -288,13 +288,13 @@
         <w:rPr>
           <w:rFonts w:cs="Calibri"/>
         </w:rPr>
-        <w:t>Date:   0</w:t>
+        <w:t xml:space="preserve">Date:   </w:t>
       </w:r>
       <w:r>
         <w:rPr>
           <w:rFonts w:cs="Calibri"/>
         </w:rPr>
-        <w:t>5</w:t>
+        <w:t>06</w:t>
       </w:r>
       <w:r>
         <w:rPr>
@@ -425,13 +425,13 @@
         <w:tblLook w:val="04A0" w:firstRow="1" w:lastRow="0" w:firstColumn="1" w:lastColumn="0" w:noHBand="0" w:noVBand="1"/>
       </w:tblPr>
       <w:tblGrid>
-        <w:gridCol w:w="974"/>
-        <w:gridCol w:w="1029"/>
-        <w:gridCol w:w="888"/>
+        <w:gridCol w:w="951"/>
+        <w:gridCol w:w="1082"/>
+        <w:gridCol w:w="871"/>
         <w:gridCol w:w="3257"/>
-        <w:gridCol w:w="1295"/>
-        <w:gridCol w:w="843"/>
-        <w:gridCol w:w="1074"/>
+        <w:gridCol w:w="1292"/>
+        <w:gridCol w:w="835"/>
+        <w:gridCol w:w="1072"/>
       </w:tblGrid>
       <w:tr>
         <w:trPr>
@@ -439,7 +439,7 @@
         </w:trPr>
         <w:tc>
           <w:tcPr>
-            <w:tcW w:w="1440" w:type="dxa"/>
+            <w:tcW w:w="831" w:type="dxa"/>
             <w:tcBorders>
               <w:top w:val="single" w:sz="8" w:space="0" w:color="000000"/>
               <w:left w:val="single" w:sz="8" w:space="0" w:color="000000"/>
@@ -458,7 +458,7 @@
         </w:tc>
         <w:tc>
           <w:tcPr>
-            <w:tcW w:w="1420" w:type="dxa"/>
+            <w:tcW w:w="1172" w:type="dxa"/>
             <w:tcBorders>
               <w:top w:val="single" w:sz="8" w:space="0" w:color="000000"/>
               <w:left w:val="single" w:sz="8" w:space="0" w:color="000000"/>
@@ -477,7 +477,7 @@
         </w:tc>
         <w:tc>
           <w:tcPr>
-            <w:tcW w:w="1480" w:type="dxa"/>
+            <w:tcW w:w="888" w:type="dxa"/>
             <w:tcBorders>
               <w:top w:val="single" w:sz="8" w:space="0" w:color="000000"/>
               <w:left w:val="single" w:sz="8" w:space="0" w:color="000000"/>
@@ -500,7 +500,7 @@
         </w:tc>
         <w:tc>
           <w:tcPr>
-            <w:tcW w:w="1420" w:type="dxa"/>
+            <w:tcW w:w="3257" w:type="dxa"/>
             <w:tcBorders>
               <w:top w:val="single" w:sz="8" w:space="0" w:color="000000"/>
               <w:left w:val="single" w:sz="8" w:space="0" w:color="000000"/>
@@ -522,7 +522,7 @@
         </w:tc>
         <w:tc>
           <w:tcPr>
-            <w:tcW w:w="1380" w:type="dxa"/>
+            <w:tcW w:w="1295" w:type="dxa"/>
             <w:tcBorders>
               <w:top w:val="single" w:sz="8" w:space="0" w:color="000000"/>
               <w:left w:val="single" w:sz="8" w:space="0" w:color="000000"/>
@@ -541,7 +541,7 @@
         </w:tc>
         <w:tc>
           <w:tcPr>
-            <w:tcW w:w="1100" w:type="dxa"/>
+            <w:tcW w:w="843" w:type="dxa"/>
             <w:tcBorders>
               <w:top w:val="single" w:sz="8" w:space="0" w:color="000000"/>
               <w:left w:val="single" w:sz="8" w:space="0" w:color="000000"/>
@@ -560,7 +560,7 @@
         </w:tc>
         <w:tc>
           <w:tcPr>
-            <w:tcW w:w="1120" w:type="dxa"/>
+            <w:tcW w:w="1074" w:type="dxa"/>
             <w:tcBorders>
               <w:top w:val="single" w:sz="8" w:space="0" w:color="000000"/>
               <w:left w:val="single" w:sz="8" w:space="0" w:color="000000"/>
@@ -594,11 +594,11 @@
       </w:tr>
       <w:tr>
         <w:trPr>
-          <w:trHeight w:val="860"/>
+          <w:trHeight w:val="586"/>
         </w:trPr>
         <w:tc>
           <w:tcPr>
-            <w:tcW w:w="1440" w:type="dxa"/>
+            <w:tcW w:w="831" w:type="dxa"/>
             <w:tcBorders>
               <w:top w:val="single" w:sz="8" w:space="0" w:color="000000"/>
               <w:left w:val="single" w:sz="8" w:space="0" w:color="000000"/>
@@ -614,7 +614,7 @@
         </w:tc>
         <w:tc>
           <w:tcPr>
-            <w:tcW w:w="1420" w:type="dxa"/>
+            <w:tcW w:w="1172" w:type="dxa"/>
             <w:tcBorders>
               <w:top w:val="single" w:sz="8" w:space="0" w:color="000000"/>
               <w:left w:val="single" w:sz="8" w:space="0" w:color="000000"/>
@@ -633,7 +633,7 @@
         </w:tc>
         <w:tc>
           <w:tcPr>
-            <w:tcW w:w="1480" w:type="dxa"/>
+            <w:tcW w:w="888" w:type="dxa"/>
             <w:tcBorders>
               <w:top w:val="single" w:sz="8" w:space="0" w:color="000000"/>
               <w:left w:val="single" w:sz="8" w:space="0" w:color="000000"/>
@@ -652,7 +652,7 @@
         </w:tc>
         <w:tc>
           <w:tcPr>
-            <w:tcW w:w="1420" w:type="dxa"/>
+            <w:tcW w:w="3257" w:type="dxa"/>
             <w:tcBorders>
               <w:top w:val="single" w:sz="8" w:space="0" w:color="000000"/>
               <w:left w:val="single" w:sz="8" w:space="0" w:color="000000"/>
@@ -671,7 +671,7 @@
         </w:tc>
         <w:tc>
           <w:tcPr>
-            <w:tcW w:w="1380" w:type="dxa"/>
+            <w:tcW w:w="1295" w:type="dxa"/>
             <w:tcBorders>
               <w:top w:val="single" w:sz="8" w:space="0" w:color="000000"/>
               <w:left w:val="single" w:sz="8" w:space="0" w:color="000000"/>
@@ -687,7 +687,7 @@
         </w:tc>
         <w:tc>
           <w:tcPr>
-            <w:tcW w:w="1100" w:type="dxa"/>
+            <w:tcW w:w="843" w:type="dxa"/>
             <w:tcBorders>
               <w:top w:val="single" w:sz="8" w:space="0" w:color="000000"/>
               <w:left w:val="single" w:sz="8" w:space="0" w:color="000000"/>
@@ -703,7 +703,7 @@
         </w:tc>
         <w:tc>
           <w:tcPr>
-            <w:tcW w:w="1120" w:type="dxa"/>
+            <w:tcW w:w="1074" w:type="dxa"/>
             <w:tcBorders>
               <w:top w:val="single" w:sz="8" w:space="0" w:color="000000"/>
               <w:left w:val="single" w:sz="8" w:space="0" w:color="000000"/>
@@ -735,11 +735,11 @@
       </w:tr>
       <w:tr>
         <w:trPr>
-          <w:trHeight w:val="820"/>
+          <w:trHeight w:val="638"/>
         </w:trPr>
         <w:tc>
           <w:tcPr>
-            <w:tcW w:w="1440" w:type="dxa"/>
+            <w:tcW w:w="831" w:type="dxa"/>
             <w:tcBorders>
               <w:top w:val="single" w:sz="8" w:space="0" w:color="000000"/>
               <w:left w:val="single" w:sz="8" w:space="0" w:color="000000"/>
@@ -760,7 +760,7 @@
         </w:tc>
         <w:tc>
           <w:tcPr>
-            <w:tcW w:w="1420" w:type="dxa"/>
+            <w:tcW w:w="1172" w:type="dxa"/>
             <w:tcBorders>
               <w:top w:val="single" w:sz="8" w:space="0" w:color="000000"/>
               <w:left w:val="single" w:sz="8" w:space="0" w:color="000000"/>
@@ -776,7 +776,7 @@
         </w:tc>
         <w:tc>
           <w:tcPr>
-            <w:tcW w:w="1480" w:type="dxa"/>
+            <w:tcW w:w="888" w:type="dxa"/>
             <w:tcBorders>
               <w:top w:val="single" w:sz="8" w:space="0" w:color="000000"/>
               <w:left w:val="single" w:sz="8" w:space="0" w:color="000000"/>
@@ -795,7 +795,7 @@
         </w:tc>
         <w:tc>
           <w:tcPr>
-            <w:tcW w:w="1420" w:type="dxa"/>
+            <w:tcW w:w="3257" w:type="dxa"/>
             <w:tcBorders>
               <w:top w:val="single" w:sz="8" w:space="0" w:color="000000"/>
               <w:left w:val="single" w:sz="8" w:space="0" w:color="000000"/>
@@ -814,7 +814,7 @@
         </w:tc>
         <w:tc>
           <w:tcPr>
-            <w:tcW w:w="1380" w:type="dxa"/>
+            <w:tcW w:w="1295" w:type="dxa"/>
             <w:tcBorders>
               <w:top w:val="single" w:sz="8" w:space="0" w:color="000000"/>
               <w:left w:val="single" w:sz="8" w:space="0" w:color="000000"/>
@@ -830,7 +830,7 @@
         </w:tc>
         <w:tc>
           <w:tcPr>
-            <w:tcW w:w="1100" w:type="dxa"/>
+            <w:tcW w:w="843" w:type="dxa"/>
             <w:tcBorders>
               <w:top w:val="single" w:sz="8" w:space="0" w:color="000000"/>
               <w:left w:val="single" w:sz="8" w:space="0" w:color="000000"/>
@@ -846,7 +846,7 @@
         </w:tc>
         <w:tc>
           <w:tcPr>
-            <w:tcW w:w="1120" w:type="dxa"/>
+            <w:tcW w:w="1074" w:type="dxa"/>
             <w:tcBorders>
               <w:top w:val="single" w:sz="8" w:space="0" w:color="000000"/>
               <w:left w:val="single" w:sz="8" w:space="0" w:color="000000"/>
@@ -866,11 +866,11 @@
       </w:tr>
       <w:tr>
         <w:trPr>
-          <w:trHeight w:val="960"/>
+          <w:trHeight w:val="762"/>
         </w:trPr>
         <w:tc>
           <w:tcPr>
-            <w:tcW w:w="1440" w:type="dxa"/>
+            <w:tcW w:w="831" w:type="dxa"/>
             <w:tcBorders>
               <w:top w:val="single" w:sz="8" w:space="0" w:color="000000"/>
               <w:left w:val="single" w:sz="8" w:space="0" w:color="000000"/>
@@ -891,7 +891,7 @@
         </w:tc>
         <w:tc>
           <w:tcPr>
-            <w:tcW w:w="1420" w:type="dxa"/>
+            <w:tcW w:w="1172" w:type="dxa"/>
             <w:tcBorders>
               <w:top w:val="single" w:sz="8" w:space="0" w:color="000000"/>
               <w:left w:val="single" w:sz="8" w:space="0" w:color="000000"/>
@@ -907,7 +907,7 @@
         </w:tc>
         <w:tc>
           <w:tcPr>
-            <w:tcW w:w="1480" w:type="dxa"/>
+            <w:tcW w:w="888" w:type="dxa"/>
             <w:tcBorders>
               <w:top w:val="single" w:sz="8" w:space="0" w:color="000000"/>
               <w:left w:val="single" w:sz="8" w:space="0" w:color="000000"/>
@@ -926,7 +926,7 @@
         </w:tc>
         <w:tc>
           <w:tcPr>
-            <w:tcW w:w="1420" w:type="dxa"/>
+            <w:tcW w:w="3257" w:type="dxa"/>
             <w:tcBorders>
               <w:top w:val="single" w:sz="8" w:space="0" w:color="000000"/>
               <w:left w:val="single" w:sz="8" w:space="0" w:color="000000"/>
@@ -945,7 +945,7 @@
         </w:tc>
         <w:tc>
           <w:tcPr>
-            <w:tcW w:w="1380" w:type="dxa"/>
+            <w:tcW w:w="1295" w:type="dxa"/>
             <w:tcBorders>
               <w:top w:val="single" w:sz="8" w:space="0" w:color="000000"/>
               <w:left w:val="single" w:sz="8" w:space="0" w:color="000000"/>
@@ -961,7 +961,7 @@
         </w:tc>
         <w:tc>
           <w:tcPr>
-            <w:tcW w:w="1100" w:type="dxa"/>
+            <w:tcW w:w="843" w:type="dxa"/>
             <w:tcBorders>
               <w:top w:val="single" w:sz="8" w:space="0" w:color="000000"/>
               <w:left w:val="single" w:sz="8" w:space="0" w:color="000000"/>
@@ -977,7 +977,7 @@
         </w:tc>
         <w:tc>
           <w:tcPr>
-            <w:tcW w:w="1120" w:type="dxa"/>
+            <w:tcW w:w="1074" w:type="dxa"/>
             <w:tcBorders>
               <w:top w:val="single" w:sz="8" w:space="0" w:color="000000"/>
               <w:left w:val="single" w:sz="8" w:space="0" w:color="000000"/>
@@ -1001,7 +1001,7 @@
         </w:trPr>
         <w:tc>
           <w:tcPr>
-            <w:tcW w:w="1440" w:type="dxa"/>
+            <w:tcW w:w="831" w:type="dxa"/>
             <w:tcBorders>
               <w:top w:val="single" w:sz="8" w:space="0" w:color="000000"/>
               <w:left w:val="single" w:sz="8" w:space="0" w:color="000000"/>
@@ -1022,7 +1022,7 @@
         </w:tc>
         <w:tc>
           <w:tcPr>
-            <w:tcW w:w="1420" w:type="dxa"/>
+            <w:tcW w:w="1172" w:type="dxa"/>
             <w:tcBorders>
               <w:top w:val="single" w:sz="8" w:space="0" w:color="000000"/>
               <w:left w:val="single" w:sz="8" w:space="0" w:color="000000"/>
@@ -1038,7 +1038,7 @@
         </w:tc>
         <w:tc>
           <w:tcPr>
-            <w:tcW w:w="1480" w:type="dxa"/>
+            <w:tcW w:w="888" w:type="dxa"/>
             <w:tcBorders>
               <w:top w:val="single" w:sz="8" w:space="0" w:color="000000"/>
               <w:left w:val="single" w:sz="8" w:space="0" w:color="000000"/>
@@ -1057,7 +1057,7 @@
         </w:tc>
         <w:tc>
           <w:tcPr>
-            <w:tcW w:w="1420" w:type="dxa"/>
+            <w:tcW w:w="3257" w:type="dxa"/>
             <w:tcBorders>
               <w:top w:val="single" w:sz="8" w:space="0" w:color="000000"/>
               <w:left w:val="single" w:sz="8" w:space="0" w:color="000000"/>
@@ -1088,7 +1088,7 @@
         </w:tc>
         <w:tc>
           <w:tcPr>
-            <w:tcW w:w="1380" w:type="dxa"/>
+            <w:tcW w:w="1295" w:type="dxa"/>
             <w:tcBorders>
               <w:top w:val="single" w:sz="8" w:space="0" w:color="000000"/>
               <w:left w:val="single" w:sz="8" w:space="0" w:color="000000"/>
@@ -1104,7 +1104,7 @@
         </w:tc>
         <w:tc>
           <w:tcPr>
-            <w:tcW w:w="1100" w:type="dxa"/>
+            <w:tcW w:w="843" w:type="dxa"/>
             <w:tcBorders>
               <w:top w:val="single" w:sz="8" w:space="0" w:color="000000"/>
               <w:left w:val="single" w:sz="8" w:space="0" w:color="000000"/>
@@ -1120,7 +1120,7 @@
         </w:tc>
         <w:tc>
           <w:tcPr>
-            <w:tcW w:w="1120" w:type="dxa"/>
+            <w:tcW w:w="1074" w:type="dxa"/>
             <w:tcBorders>
               <w:top w:val="single" w:sz="8" w:space="0" w:color="000000"/>
               <w:left w:val="single" w:sz="8" w:space="0" w:color="000000"/>
@@ -1144,7 +1144,7 @@
         </w:trPr>
         <w:tc>
           <w:tcPr>
-            <w:tcW w:w="1440" w:type="dxa"/>
+            <w:tcW w:w="831" w:type="dxa"/>
             <w:tcBorders>
               <w:top w:val="single" w:sz="8" w:space="0" w:color="000000"/>
               <w:left w:val="single" w:sz="8" w:space="0" w:color="000000"/>
@@ -1165,7 +1165,7 @@
         </w:tc>
         <w:tc>
           <w:tcPr>
-            <w:tcW w:w="1420" w:type="dxa"/>
+            <w:tcW w:w="1172" w:type="dxa"/>
             <w:tcBorders>
               <w:top w:val="single" w:sz="8" w:space="0" w:color="000000"/>
               <w:left w:val="single" w:sz="8" w:space="0" w:color="000000"/>
@@ -1184,7 +1184,7 @@
         </w:tc>
         <w:tc>
           <w:tcPr>
-            <w:tcW w:w="1480" w:type="dxa"/>
+            <w:tcW w:w="888" w:type="dxa"/>
             <w:tcBorders>
               <w:top w:val="single" w:sz="8" w:space="0" w:color="000000"/>
               <w:left w:val="single" w:sz="8" w:space="0" w:color="000000"/>
@@ -1203,7 +1203,7 @@
         </w:tc>
         <w:tc>
           <w:tcPr>
-            <w:tcW w:w="1420" w:type="dxa"/>
+            <w:tcW w:w="3257" w:type="dxa"/>
             <w:tcBorders>
               <w:top w:val="single" w:sz="8" w:space="0" w:color="000000"/>
               <w:left w:val="single" w:sz="8" w:space="0" w:color="000000"/>
@@ -1241,7 +1241,7 @@
         </w:tc>
         <w:tc>
           <w:tcPr>
-            <w:tcW w:w="1380" w:type="dxa"/>
+            <w:tcW w:w="1295" w:type="dxa"/>
             <w:tcBorders>
               <w:top w:val="single" w:sz="8" w:space="0" w:color="000000"/>
               <w:left w:val="single" w:sz="8" w:space="0" w:color="000000"/>
@@ -1257,7 +1257,7 @@
         </w:tc>
         <w:tc>
           <w:tcPr>
-            <w:tcW w:w="1100" w:type="dxa"/>
+            <w:tcW w:w="843" w:type="dxa"/>
             <w:tcBorders>
               <w:top w:val="single" w:sz="8" w:space="0" w:color="000000"/>
               <w:left w:val="single" w:sz="8" w:space="0" w:color="000000"/>
@@ -1273,7 +1273,7 @@
         </w:tc>
         <w:tc>
           <w:tcPr>
-            <w:tcW w:w="1120" w:type="dxa"/>
+            <w:tcW w:w="1074" w:type="dxa"/>
             <w:tcBorders>
               <w:top w:val="single" w:sz="8" w:space="0" w:color="000000"/>
               <w:left w:val="single" w:sz="8" w:space="0" w:color="000000"/>
@@ -1293,11 +1293,11 @@
       </w:tr>
       <w:tr>
         <w:trPr>
-          <w:trHeight w:val="820"/>
+          <w:trHeight w:val="542"/>
         </w:trPr>
         <w:tc>
           <w:tcPr>
-            <w:tcW w:w="1440" w:type="dxa"/>
+            <w:tcW w:w="831" w:type="dxa"/>
             <w:tcBorders>
               <w:top w:val="single" w:sz="8" w:space="0" w:color="000000"/>
               <w:left w:val="single" w:sz="8" w:space="0" w:color="000000"/>
@@ -1318,7 +1318,7 @@
         </w:tc>
         <w:tc>
           <w:tcPr>
-            <w:tcW w:w="1420" w:type="dxa"/>
+            <w:tcW w:w="1172" w:type="dxa"/>
             <w:tcBorders>
               <w:top w:val="single" w:sz="8" w:space="0" w:color="000000"/>
               <w:left w:val="single" w:sz="8" w:space="0" w:color="000000"/>
@@ -1334,7 +1334,7 @@
         </w:tc>
         <w:tc>
           <w:tcPr>
-            <w:tcW w:w="1480" w:type="dxa"/>
+            <w:tcW w:w="888" w:type="dxa"/>
             <w:tcBorders>
               <w:top w:val="single" w:sz="8" w:space="0" w:color="000000"/>
               <w:left w:val="single" w:sz="8" w:space="0" w:color="000000"/>
@@ -1353,7 +1353,7 @@
         </w:tc>
         <w:tc>
           <w:tcPr>
-            <w:tcW w:w="1420" w:type="dxa"/>
+            <w:tcW w:w="3257" w:type="dxa"/>
             <w:tcBorders>
               <w:top w:val="single" w:sz="8" w:space="0" w:color="000000"/>
               <w:left w:val="single" w:sz="8" w:space="0" w:color="000000"/>
@@ -1373,7 +1373,7 @@
         </w:tc>
         <w:tc>
           <w:tcPr>
-            <w:tcW w:w="1380" w:type="dxa"/>
+            <w:tcW w:w="1295" w:type="dxa"/>
             <w:tcBorders>
               <w:top w:val="single" w:sz="8" w:space="0" w:color="000000"/>
               <w:left w:val="single" w:sz="8" w:space="0" w:color="000000"/>
@@ -1389,7 +1389,7 @@
         </w:tc>
         <w:tc>
           <w:tcPr>
-            <w:tcW w:w="1100" w:type="dxa"/>
+            <w:tcW w:w="843" w:type="dxa"/>
             <w:tcBorders>
               <w:top w:val="single" w:sz="8" w:space="0" w:color="000000"/>
               <w:left w:val="single" w:sz="8" w:space="0" w:color="000000"/>
@@ -1405,7 +1405,7 @@
         </w:tc>
         <w:tc>
           <w:tcPr>
-            <w:tcW w:w="1120" w:type="dxa"/>
+            <w:tcW w:w="1074" w:type="dxa"/>
             <w:tcBorders>
               <w:top w:val="single" w:sz="8" w:space="0" w:color="000000"/>
               <w:left w:val="single" w:sz="8" w:space="0" w:color="000000"/>
@@ -1437,14 +1437,17 @@
     </w:p>
     <w:p>
       <w:pPr>
-        <w:spacing w:after="0"/>
+        <w:spacing w:after="172" w:line="250" w:lineRule="auto"/>
+        <w:ind w:left="-5" w:right="8450" w:hanging="10"/>
+        <w:rPr>
+          <w:rFonts w:cs="Calibri"/>
+        </w:rPr>
       </w:pPr>
       <w:r>
         <w:rPr>
           <w:rFonts w:cs="Calibri"/>
-          <w:i/>
-        </w:rPr>
-        <w:t xml:space="preserve"> </w:t>
+        </w:rPr>
+        <w:t xml:space="preserve">Sincerely, </w:t>
       </w:r>
     </w:p>
     <w:p>
@@ -1456,7 +1459,7 @@
         <w:rPr>
           <w:rFonts w:cs="Calibri"/>
         </w:rPr>
-        <w:t xml:space="preserve">Sincerely,  </w:t>
+        <w:t>Asutosh Singh</w:t>
       </w:r>
     </w:p>
     <w:sectPr>
@@ -1881,6 +1884,7 @@
   <w:style w:type="character" w:default="1" w:styleId="DefaultParagraphFont">
     <w:name w:val="Default Paragraph Font"/>
     <w:uiPriority w:val="1"/>
+    <w:semiHidden/>
     <w:unhideWhenUsed/>
   </w:style>
   <w:style w:type="table" w:default="1" w:styleId="TableNormal">

</xml_diff>

<commit_message>
docs: update presentation and project documents
</commit_message>
<xml_diff>
--- a/TheLOLgorithms_AshutoshSingh_7985481629.docx
+++ b/TheLOLgorithms_AshutoshSingh_7985481629.docx
@@ -368,7 +368,6 @@
         <w:spacing w:after="4" w:line="250" w:lineRule="auto"/>
         <w:ind w:left="-5" w:hanging="10"/>
       </w:pPr>
-      <w:proofErr w:type="gramStart"/>
       <w:r>
         <w:rPr>
           <w:rFonts w:cs="Calibri"/>
@@ -376,13 +375,19 @@
         </w:rPr>
         <w:t>Team :</w:t>
       </w:r>
-      <w:proofErr w:type="gramEnd"/>
       <w:r>
         <w:rPr>
           <w:rFonts w:cs="Calibri"/>
           <w:b/>
         </w:rPr>
-        <w:t xml:space="preserve"> The </w:t>
+        <w:t xml:space="preserve"> The</w:t>
+      </w:r>
+      <w:r>
+        <w:rPr>
+          <w:rFonts w:cs="Calibri"/>
+          <w:b/>
+        </w:rPr>
+        <w:t>-</w:t>
       </w:r>
       <w:proofErr w:type="spellStart"/>
       <w:r>

</xml_diff>